<commit_message>
Clarify sample test outline
</commit_message>
<xml_diff>
--- a/project-resources/pisemka-uprava-textu-spanek/pisemka-uprava-textu-spanek.docx
+++ b/project-resources/pisemka-uprava-textu-spanek/pisemka-uprava-textu-spanek.docx
@@ -487,163 +487,180 @@
           <w:rFonts w:ascii="Arial" w:hAnsi="Arial"/>
           <w:color w:val="000000"/>
         </w:rPr>
-        <w:t>Doporučená struktura dokumentu</w:t>
+        <w:t>Požadovaná struktura dokumentu</w:t>
       </w:r>
     </w:p>
     <w:p>
       <w:pPr>
-        <w:pStyle w:val="ListBullet"/>
-        <w:spacing w:after="0"/>
+        <w:spacing w:after="120" w:line="259" w:lineRule="auto"/>
       </w:pPr>
       <w:r>
         <w:rPr>
           <w:rFonts w:ascii="Arial" w:hAnsi="Arial"/>
-          <w:sz w:val="20"/>
+          <w:sz w:val="22"/>
         </w:rPr>
-        <w:t>titulní strana</w:t>
+        <w:t>Dodržte tuto strukturu dokumentu:</w:t>
       </w:r>
     </w:p>
+    <w:tbl>
+      <w:tblPr>
+        <w:tblW w:type="auto" w:w="0"/>
+        <w:jc w:val="center"/>
+        <w:tblLook w:firstColumn="1" w:firstRow="1" w:lastColumn="0" w:lastRow="0" w:noHBand="0" w:noVBand="1" w:val="04A0"/>
+        <w:tblBorders>
+          <w:top w:val="single" w:sz="6" w:space="0" w:color="D9D9D9"/>
+          <w:left w:val="single" w:sz="6" w:space="0" w:color="D9D9D9"/>
+          <w:bottom w:val="single" w:sz="6" w:space="0" w:color="D9D9D9"/>
+          <w:right w:val="single" w:sz="6" w:space="0" w:color="D9D9D9"/>
+          <w:insideH w:val="single" w:sz="6" w:space="0" w:color="D9D9D9"/>
+          <w:insideV w:val="single" w:sz="6" w:space="0" w:color="D9D9D9"/>
+        </w:tblBorders>
+      </w:tblPr>
+      <w:tblGrid>
+        <w:gridCol w:w="9972"/>
+      </w:tblGrid>
+      <w:tr>
+        <w:tc>
+          <w:tcPr>
+            <w:tcW w:type="dxa" w:w="9972"/>
+            <w:shd w:fill="F5F5F5"/>
+            <w:vAlign w:val="center"/>
+          </w:tcPr>
+          <w:p>
+            <w:pPr>
+              <w:spacing w:after="0"/>
+            </w:pPr>
+            <w:r>
+              <w:rPr>
+                <w:rFonts w:ascii="Courier New" w:hAnsi="Courier New"/>
+                <w:sz w:val="19"/>
+              </w:rPr>
+              <w:t>Titulní strana</w:t>
+            </w:r>
+            <w:r>
+              <w:br/>
+            </w:r>
+            <w:r>
+              <w:rPr>
+                <w:rFonts w:ascii="Courier New" w:hAnsi="Courier New"/>
+                <w:sz w:val="19"/>
+              </w:rPr>
+              <w:t>Obsah</w:t>
+            </w:r>
+            <w:r>
+              <w:br/>
+            </w:r>
+            <w:r>
+              <w:rPr>
+                <w:rFonts w:ascii="Courier New" w:hAnsi="Courier New"/>
+                <w:sz w:val="19"/>
+              </w:rPr>
+              <w:t>1 Úvod</w:t>
+            </w:r>
+            <w:r>
+              <w:br/>
+            </w:r>
+            <w:r>
+              <w:rPr>
+                <w:rFonts w:ascii="Courier New" w:hAnsi="Courier New"/>
+                <w:sz w:val="19"/>
+              </w:rPr>
+              <w:t>2 Spánek a soustředění</w:t>
+            </w:r>
+            <w:r>
+              <w:br/>
+            </w:r>
+            <w:r>
+              <w:rPr>
+                <w:rFonts w:ascii="Courier New" w:hAnsi="Courier New"/>
+                <w:sz w:val="19"/>
+              </w:rPr>
+              <w:t xml:space="preserve">  2.1 Délka spánku</w:t>
+            </w:r>
+            <w:r>
+              <w:br/>
+            </w:r>
+            <w:r>
+              <w:rPr>
+                <w:rFonts w:ascii="Courier New" w:hAnsi="Courier New"/>
+                <w:sz w:val="19"/>
+              </w:rPr>
+              <w:t xml:space="preserve">  2.2 Kvalita spánku</w:t>
+            </w:r>
+            <w:r>
+              <w:br/>
+            </w:r>
+            <w:r>
+              <w:rPr>
+                <w:rFonts w:ascii="Courier New" w:hAnsi="Courier New"/>
+                <w:sz w:val="19"/>
+              </w:rPr>
+              <w:t>3 Krátké šetření mezi studenty</w:t>
+            </w:r>
+            <w:r>
+              <w:br/>
+            </w:r>
+            <w:r>
+              <w:rPr>
+                <w:rFonts w:ascii="Courier New" w:hAnsi="Courier New"/>
+                <w:sz w:val="19"/>
+              </w:rPr>
+              <w:t xml:space="preserve">  3.1 Výsledky dotazníku</w:t>
+            </w:r>
+            <w:r>
+              <w:br/>
+            </w:r>
+            <w:r>
+              <w:rPr>
+                <w:rFonts w:ascii="Courier New" w:hAnsi="Courier New"/>
+                <w:sz w:val="19"/>
+              </w:rPr>
+              <w:t>4 Závěr</w:t>
+            </w:r>
+            <w:r>
+              <w:br/>
+            </w:r>
+            <w:r>
+              <w:rPr>
+                <w:rFonts w:ascii="Courier New" w:hAnsi="Courier New"/>
+                <w:sz w:val="19"/>
+              </w:rPr>
+              <w:t>Seznam použité literatury</w:t>
+            </w:r>
+            <w:r>
+              <w:br/>
+            </w:r>
+            <w:r>
+              <w:rPr>
+                <w:rFonts w:ascii="Courier New" w:hAnsi="Courier New"/>
+                <w:sz w:val="19"/>
+              </w:rPr>
+              <w:t>Seznam obrázků a grafů</w:t>
+            </w:r>
+            <w:r>
+              <w:br/>
+            </w:r>
+            <w:r>
+              <w:rPr>
+                <w:rFonts w:ascii="Courier New" w:hAnsi="Courier New"/>
+                <w:sz w:val="19"/>
+              </w:rPr>
+              <w:t>Seznam tabulek</w:t>
+            </w:r>
+          </w:p>
+        </w:tc>
+      </w:tr>
+    </w:tbl>
     <w:p>
       <w:pPr>
-        <w:pStyle w:val="ListBullet"/>
-        <w:spacing w:after="0"/>
+        <w:spacing w:after="120" w:line="259" w:lineRule="auto"/>
       </w:pPr>
       <w:r>
         <w:rPr>
           <w:rFonts w:ascii="Arial" w:hAnsi="Arial"/>
-          <w:sz w:val="20"/>
+          <w:sz w:val="22"/>
         </w:rPr>
-        <w:t>obsah</w:t>
-      </w:r>
-    </w:p>
-    <w:p>
-      <w:pPr>
-        <w:pStyle w:val="ListBullet"/>
-        <w:spacing w:after="0"/>
-      </w:pPr>
-      <w:r>
-        <w:rPr>
-          <w:rFonts w:ascii="Arial" w:hAnsi="Arial"/>
-          <w:sz w:val="20"/>
-        </w:rPr>
-        <w:t>Úvod</w:t>
-      </w:r>
-    </w:p>
-    <w:p>
-      <w:pPr>
-        <w:pStyle w:val="ListBullet"/>
-        <w:spacing w:after="0"/>
-      </w:pPr>
-      <w:r>
-        <w:rPr>
-          <w:rFonts w:ascii="Arial" w:hAnsi="Arial"/>
-          <w:sz w:val="20"/>
-        </w:rPr>
-        <w:t>Spánek a soustředění</w:t>
-      </w:r>
-    </w:p>
-    <w:p>
-      <w:pPr>
-        <w:pStyle w:val="ListBullet"/>
-        <w:spacing w:after="0"/>
-      </w:pPr>
-      <w:r>
-        <w:rPr>
-          <w:rFonts w:ascii="Arial" w:hAnsi="Arial"/>
-          <w:sz w:val="20"/>
-        </w:rPr>
-        <w:t>Délka spánku</w:t>
-      </w:r>
-    </w:p>
-    <w:p>
-      <w:pPr>
-        <w:pStyle w:val="ListBullet"/>
-        <w:spacing w:after="0"/>
-      </w:pPr>
-      <w:r>
-        <w:rPr>
-          <w:rFonts w:ascii="Arial" w:hAnsi="Arial"/>
-          <w:sz w:val="20"/>
-        </w:rPr>
-        <w:t>Kvalita spánku</w:t>
-      </w:r>
-    </w:p>
-    <w:p>
-      <w:pPr>
-        <w:pStyle w:val="ListBullet"/>
-        <w:spacing w:after="0"/>
-      </w:pPr>
-      <w:r>
-        <w:rPr>
-          <w:rFonts w:ascii="Arial" w:hAnsi="Arial"/>
-          <w:sz w:val="20"/>
-        </w:rPr>
-        <w:t>Krátké šetření mezi studenty</w:t>
-      </w:r>
-    </w:p>
-    <w:p>
-      <w:pPr>
-        <w:pStyle w:val="ListBullet"/>
-        <w:spacing w:after="0"/>
-      </w:pPr>
-      <w:r>
-        <w:rPr>
-          <w:rFonts w:ascii="Arial" w:hAnsi="Arial"/>
-          <w:sz w:val="20"/>
-        </w:rPr>
-        <w:t>Výsledky dotazníku</w:t>
-      </w:r>
-    </w:p>
-    <w:p>
-      <w:pPr>
-        <w:pStyle w:val="ListBullet"/>
-        <w:spacing w:after="0"/>
-      </w:pPr>
-      <w:r>
-        <w:rPr>
-          <w:rFonts w:ascii="Arial" w:hAnsi="Arial"/>
-          <w:sz w:val="20"/>
-        </w:rPr>
-        <w:t>Závěr</w:t>
-      </w:r>
-    </w:p>
-    <w:p>
-      <w:pPr>
-        <w:pStyle w:val="ListBullet"/>
-        <w:spacing w:after="0"/>
-      </w:pPr>
-      <w:r>
-        <w:rPr>
-          <w:rFonts w:ascii="Arial" w:hAnsi="Arial"/>
-          <w:sz w:val="20"/>
-        </w:rPr>
-        <w:t>Seznam použité literatury</w:t>
-      </w:r>
-    </w:p>
-    <w:p>
-      <w:pPr>
-        <w:pStyle w:val="ListBullet"/>
-        <w:spacing w:after="0"/>
-      </w:pPr>
-      <w:r>
-        <w:rPr>
-          <w:rFonts w:ascii="Arial" w:hAnsi="Arial"/>
-          <w:sz w:val="20"/>
-        </w:rPr>
-        <w:t>Seznam obrázků a grafů</w:t>
-      </w:r>
-    </w:p>
-    <w:p>
-      <w:pPr>
-        <w:pStyle w:val="ListBullet"/>
-        <w:spacing w:after="0"/>
-      </w:pPr>
-      <w:r>
-        <w:rPr>
-          <w:rFonts w:ascii="Arial" w:hAnsi="Arial"/>
-          <w:sz w:val="20"/>
-        </w:rPr>
-        <w:t>Seznam tabulek</w:t>
+        <w:t>Čísla nadpisů nesmí být napsaná ručně. Použijte připravený skript nebo číslovaný seznam navázaný na nadpisy.</w:t>
       </w:r>
     </w:p>
     <w:p>
@@ -1547,29 +1564,6 @@
         <w:t>Seznam použité literatury</w:t>
       </w:r>
     </w:p>
-    <w:p>
-      <w:pPr>
-        <w:spacing w:after="40"/>
-      </w:pPr>
-      <w:r>
-        <w:rPr>
-          <w:rFonts w:ascii="Courier New" w:hAnsi="Courier New"/>
-          <w:sz w:val="20"/>
-        </w:rPr>
-      </w:r>
-    </w:p>
-    <w:p>
-      <w:pPr>
-        <w:spacing w:after="40"/>
-      </w:pPr>
-      <w:r>
-        <w:rPr>
-          <w:rFonts w:ascii="Courier New" w:hAnsi="Courier New"/>
-          <w:sz w:val="20"/>
-        </w:rPr>
-        <w:t>CURCIO, Giuseppe; FERRARA, Michele; DE GENNARO, Luigi. Sleep loss, learning capacity and academic performance. Sleep Medicine Reviews, 2006, roč. 10, č. 5, s. 323-337. DOI: 10.1016/j.smrv.2005.11.001.</w:t>
-      </w:r>
-    </w:p>
     <w:sectPr>
       <w:pgSz w:w="12240" w:h="15840"/>
       <w:pgMar w:top="1134" w:right="1134" w:bottom="1134" w:left="1134" w:header="720" w:footer="720" w:gutter="0"/>

</xml_diff>

<commit_message>
Add grading rubric to sample tests
</commit_message>
<xml_diff>
--- a/project-resources/pisemka-uprava-textu-spanek/pisemka-uprava-textu-spanek.docx
+++ b/project-resources/pisemka-uprava-textu-spanek/pisemka-uprava-textu-spanek.docx
@@ -932,6 +932,228 @@
     </w:p>
     <w:p>
       <w:pPr>
+        <w:pStyle w:val="Heading2"/>
+      </w:pPr>
+      <w:r>
+        <w:rPr>
+          <w:rFonts w:ascii="Arial" w:hAnsi="Arial"/>
+          <w:color w:val="000000"/>
+        </w:rPr>
+        <w:t>Hodnocení typografických chyb</w:t>
+      </w:r>
+    </w:p>
+    <w:p>
+      <w:pPr>
+        <w:spacing w:after="120" w:line="259" w:lineRule="auto"/>
+      </w:pPr>
+      <w:r>
+        <w:rPr>
+          <w:rFonts w:ascii="Arial" w:hAnsi="Arial"/>
+          <w:sz w:val="22"/>
+        </w:rPr>
+        <w:t>Typografické chyby se počítají váženě:</w:t>
+      </w:r>
+    </w:p>
+    <w:tbl>
+      <w:tblPr>
+        <w:tblW w:type="auto" w:w="0"/>
+        <w:jc w:val="center"/>
+        <w:tblLook w:firstColumn="1" w:firstRow="1" w:lastColumn="0" w:lastRow="0" w:noHBand="0" w:noVBand="1" w:val="04A0"/>
+        <w:tblBorders>
+          <w:top w:val="single" w:sz="6" w:space="0" w:color="D9D9D9"/>
+          <w:left w:val="single" w:sz="6" w:space="0" w:color="D9D9D9"/>
+          <w:bottom w:val="single" w:sz="6" w:space="0" w:color="D9D9D9"/>
+          <w:right w:val="single" w:sz="6" w:space="0" w:color="D9D9D9"/>
+          <w:insideH w:val="single" w:sz="6" w:space="0" w:color="D9D9D9"/>
+          <w:insideV w:val="single" w:sz="6" w:space="0" w:color="D9D9D9"/>
+        </w:tblBorders>
+      </w:tblPr>
+      <w:tblGrid>
+        <w:gridCol w:w="9972"/>
+      </w:tblGrid>
+      <w:tr>
+        <w:tc>
+          <w:tcPr>
+            <w:tcW w:type="dxa" w:w="9972"/>
+            <w:shd w:fill="F5F5F5"/>
+            <w:vAlign w:val="center"/>
+          </w:tcPr>
+          <w:p>
+            <w:pPr>
+              <w:spacing w:after="0"/>
+            </w:pPr>
+            <w:r>
+              <w:rPr>
+                <w:rFonts w:ascii="Courier New" w:hAnsi="Courier New"/>
+                <w:sz w:val="19"/>
+              </w:rPr>
+              <w:t>malá chyba   = 0,5 chyby</w:t>
+            </w:r>
+            <w:r>
+              <w:br/>
+            </w:r>
+            <w:r>
+              <w:rPr>
+                <w:rFonts w:ascii="Courier New" w:hAnsi="Courier New"/>
+                <w:sz w:val="19"/>
+              </w:rPr>
+              <w:t>běžná chyba  = 1 chyba</w:t>
+            </w:r>
+            <w:r>
+              <w:br/>
+            </w:r>
+            <w:r>
+              <w:rPr>
+                <w:rFonts w:ascii="Courier New" w:hAnsi="Courier New"/>
+                <w:sz w:val="19"/>
+              </w:rPr>
+              <w:t>hrubá chyba  = 3 chyby</w:t>
+            </w:r>
+          </w:p>
+        </w:tc>
+      </w:tr>
+    </w:tbl>
+    <w:p>
+      <w:pPr>
+        <w:spacing w:after="120" w:line="259" w:lineRule="auto"/>
+      </w:pPr>
+      <w:r>
+        <w:rPr>
+          <w:rFonts w:ascii="Arial" w:hAnsi="Arial"/>
+          <w:sz w:val="22"/>
+        </w:rPr>
+        <w:t>Malá chyba je například chybějící zarovnání do bloku, drobná nejednotnost mezer nebo méně vhodné umístění obrázku.</w:t>
+      </w:r>
+    </w:p>
+    <w:p>
+      <w:pPr>
+        <w:spacing w:after="120" w:line="259" w:lineRule="auto"/>
+      </w:pPr>
+      <w:r>
+        <w:rPr>
+          <w:rFonts w:ascii="Arial" w:hAnsi="Arial"/>
+          <w:sz w:val="22"/>
+        </w:rPr>
+        <w:t>Běžná chyba je například prázdný řádek místo nastavení mezery, ruční mezery pro odsazení, špatná úroveň nadpisu, chybný tvar popisku nebo nejednotná úprava tabulky.</w:t>
+      </w:r>
+    </w:p>
+    <w:p>
+      <w:pPr>
+        <w:spacing w:after="120" w:line="259" w:lineRule="auto"/>
+      </w:pPr>
+      <w:r>
+        <w:rPr>
+          <w:rFonts w:ascii="Arial" w:hAnsi="Arial"/>
+          <w:sz w:val="22"/>
+        </w:rPr>
+        <w:t>Hrubá chyba je například ruční číslování nadpisů, rozhozené číslování nadpisů, chybějící automatický obsah, chybějící seznam obrázků a grafů, chybějící seznam tabulek, chybějící obrázek nebo tabulka, chybějící popisky nebo číslování stran od špatného místa.</w:t>
+      </w:r>
+    </w:p>
+    <w:p>
+      <w:pPr>
+        <w:spacing w:after="120" w:line="259" w:lineRule="auto"/>
+      </w:pPr>
+      <w:r>
+        <w:rPr>
+          <w:rFonts w:ascii="Arial" w:hAnsi="Arial"/>
+          <w:sz w:val="22"/>
+        </w:rPr>
+        <w:t>Přepočtený počet chyb se převede na známku takto:</w:t>
+      </w:r>
+    </w:p>
+    <w:tbl>
+      <w:tblPr>
+        <w:tblW w:type="auto" w:w="0"/>
+        <w:jc w:val="center"/>
+        <w:tblLook w:firstColumn="1" w:firstRow="1" w:lastColumn="0" w:lastRow="0" w:noHBand="0" w:noVBand="1" w:val="04A0"/>
+        <w:tblBorders>
+          <w:top w:val="single" w:sz="6" w:space="0" w:color="D9D9D9"/>
+          <w:left w:val="single" w:sz="6" w:space="0" w:color="D9D9D9"/>
+          <w:bottom w:val="single" w:sz="6" w:space="0" w:color="D9D9D9"/>
+          <w:right w:val="single" w:sz="6" w:space="0" w:color="D9D9D9"/>
+          <w:insideH w:val="single" w:sz="6" w:space="0" w:color="D9D9D9"/>
+          <w:insideV w:val="single" w:sz="6" w:space="0" w:color="D9D9D9"/>
+        </w:tblBorders>
+      </w:tblPr>
+      <w:tblGrid>
+        <w:gridCol w:w="9972"/>
+      </w:tblGrid>
+      <w:tr>
+        <w:tc>
+          <w:tcPr>
+            <w:tcW w:type="dxa" w:w="9972"/>
+            <w:shd w:fill="F5F5F5"/>
+            <w:vAlign w:val="center"/>
+          </w:tcPr>
+          <w:p>
+            <w:pPr>
+              <w:spacing w:after="0"/>
+            </w:pPr>
+            <w:r>
+              <w:rPr>
+                <w:rFonts w:ascii="Courier New" w:hAnsi="Courier New"/>
+                <w:sz w:val="19"/>
+              </w:rPr>
+              <w:t>1: 0-3 chyby</w:t>
+            </w:r>
+            <w:r>
+              <w:br/>
+            </w:r>
+            <w:r>
+              <w:rPr>
+                <w:rFonts w:ascii="Courier New" w:hAnsi="Courier New"/>
+                <w:sz w:val="19"/>
+              </w:rPr>
+              <w:t>2: 3,5-7 chyb</w:t>
+            </w:r>
+            <w:r>
+              <w:br/>
+            </w:r>
+            <w:r>
+              <w:rPr>
+                <w:rFonts w:ascii="Courier New" w:hAnsi="Courier New"/>
+                <w:sz w:val="19"/>
+              </w:rPr>
+              <w:t>3: 7,5-11 chyb</w:t>
+            </w:r>
+            <w:r>
+              <w:br/>
+            </w:r>
+            <w:r>
+              <w:rPr>
+                <w:rFonts w:ascii="Courier New" w:hAnsi="Courier New"/>
+                <w:sz w:val="19"/>
+              </w:rPr>
+              <w:t>4: 11,5-15 chyb</w:t>
+            </w:r>
+            <w:r>
+              <w:br/>
+            </w:r>
+            <w:r>
+              <w:rPr>
+                <w:rFonts w:ascii="Courier New" w:hAnsi="Courier New"/>
+                <w:sz w:val="19"/>
+              </w:rPr>
+              <w:t>5: 15,5 a více chyb</w:t>
+            </w:r>
+          </w:p>
+        </w:tc>
+      </w:tr>
+    </w:tbl>
+    <w:p>
+      <w:pPr>
+        <w:spacing w:after="120" w:line="259" w:lineRule="auto"/>
+      </w:pPr>
+      <w:r>
+        <w:rPr>
+          <w:rFonts w:ascii="Arial" w:hAnsi="Arial"/>
+          <w:sz w:val="22"/>
+        </w:rPr>
+        <w:t>Opakovaná stejná chyba se nepočítá neomezeně. Pokud se stejný typ chyby opakuje v celém dokumentu, započítá se obvykle podle rozsahu jako 2-3 chyby.</w:t>
+      </w:r>
+    </w:p>
+    <w:p>
+      <w:pPr>
         <w:sectPr>
           <w:pgSz w:w="12240" w:h="15840"/>
           <w:pgMar w:top="1134" w:right="1134" w:bottom="1134" w:left="1134" w:header="720" w:footer="720" w:gutter="0"/>

</xml_diff>

<commit_message>
Move grading rubric to separate files
</commit_message>
<xml_diff>
--- a/project-resources/pisemka-uprava-textu-spanek/pisemka-uprava-textu-spanek.docx
+++ b/project-resources/pisemka-uprava-textu-spanek/pisemka-uprava-textu-spanek.docx
@@ -932,228 +932,6 @@
     </w:p>
     <w:p>
       <w:pPr>
-        <w:pStyle w:val="Heading2"/>
-      </w:pPr>
-      <w:r>
-        <w:rPr>
-          <w:rFonts w:ascii="Arial" w:hAnsi="Arial"/>
-          <w:color w:val="000000"/>
-        </w:rPr>
-        <w:t>Hodnocení typografických chyb</w:t>
-      </w:r>
-    </w:p>
-    <w:p>
-      <w:pPr>
-        <w:spacing w:after="120" w:line="259" w:lineRule="auto"/>
-      </w:pPr>
-      <w:r>
-        <w:rPr>
-          <w:rFonts w:ascii="Arial" w:hAnsi="Arial"/>
-          <w:sz w:val="22"/>
-        </w:rPr>
-        <w:t>Typografické chyby se počítají váženě:</w:t>
-      </w:r>
-    </w:p>
-    <w:tbl>
-      <w:tblPr>
-        <w:tblW w:type="auto" w:w="0"/>
-        <w:jc w:val="center"/>
-        <w:tblLook w:firstColumn="1" w:firstRow="1" w:lastColumn="0" w:lastRow="0" w:noHBand="0" w:noVBand="1" w:val="04A0"/>
-        <w:tblBorders>
-          <w:top w:val="single" w:sz="6" w:space="0" w:color="D9D9D9"/>
-          <w:left w:val="single" w:sz="6" w:space="0" w:color="D9D9D9"/>
-          <w:bottom w:val="single" w:sz="6" w:space="0" w:color="D9D9D9"/>
-          <w:right w:val="single" w:sz="6" w:space="0" w:color="D9D9D9"/>
-          <w:insideH w:val="single" w:sz="6" w:space="0" w:color="D9D9D9"/>
-          <w:insideV w:val="single" w:sz="6" w:space="0" w:color="D9D9D9"/>
-        </w:tblBorders>
-      </w:tblPr>
-      <w:tblGrid>
-        <w:gridCol w:w="9972"/>
-      </w:tblGrid>
-      <w:tr>
-        <w:tc>
-          <w:tcPr>
-            <w:tcW w:type="dxa" w:w="9972"/>
-            <w:shd w:fill="F5F5F5"/>
-            <w:vAlign w:val="center"/>
-          </w:tcPr>
-          <w:p>
-            <w:pPr>
-              <w:spacing w:after="0"/>
-            </w:pPr>
-            <w:r>
-              <w:rPr>
-                <w:rFonts w:ascii="Courier New" w:hAnsi="Courier New"/>
-                <w:sz w:val="19"/>
-              </w:rPr>
-              <w:t>malá chyba   = 0,5 chyby</w:t>
-            </w:r>
-            <w:r>
-              <w:br/>
-            </w:r>
-            <w:r>
-              <w:rPr>
-                <w:rFonts w:ascii="Courier New" w:hAnsi="Courier New"/>
-                <w:sz w:val="19"/>
-              </w:rPr>
-              <w:t>běžná chyba  = 1 chyba</w:t>
-            </w:r>
-            <w:r>
-              <w:br/>
-            </w:r>
-            <w:r>
-              <w:rPr>
-                <w:rFonts w:ascii="Courier New" w:hAnsi="Courier New"/>
-                <w:sz w:val="19"/>
-              </w:rPr>
-              <w:t>hrubá chyba  = 3 chyby</w:t>
-            </w:r>
-          </w:p>
-        </w:tc>
-      </w:tr>
-    </w:tbl>
-    <w:p>
-      <w:pPr>
-        <w:spacing w:after="120" w:line="259" w:lineRule="auto"/>
-      </w:pPr>
-      <w:r>
-        <w:rPr>
-          <w:rFonts w:ascii="Arial" w:hAnsi="Arial"/>
-          <w:sz w:val="22"/>
-        </w:rPr>
-        <w:t>Malá chyba je například chybějící zarovnání do bloku, drobná nejednotnost mezer nebo méně vhodné umístění obrázku.</w:t>
-      </w:r>
-    </w:p>
-    <w:p>
-      <w:pPr>
-        <w:spacing w:after="120" w:line="259" w:lineRule="auto"/>
-      </w:pPr>
-      <w:r>
-        <w:rPr>
-          <w:rFonts w:ascii="Arial" w:hAnsi="Arial"/>
-          <w:sz w:val="22"/>
-        </w:rPr>
-        <w:t>Běžná chyba je například prázdný řádek místo nastavení mezery, ruční mezery pro odsazení, špatná úroveň nadpisu, chybný tvar popisku nebo nejednotná úprava tabulky.</w:t>
-      </w:r>
-    </w:p>
-    <w:p>
-      <w:pPr>
-        <w:spacing w:after="120" w:line="259" w:lineRule="auto"/>
-      </w:pPr>
-      <w:r>
-        <w:rPr>
-          <w:rFonts w:ascii="Arial" w:hAnsi="Arial"/>
-          <w:sz w:val="22"/>
-        </w:rPr>
-        <w:t>Hrubá chyba je například ruční číslování nadpisů, rozhozené číslování nadpisů, chybějící automatický obsah, chybějící seznam obrázků a grafů, chybějící seznam tabulek, chybějící obrázek nebo tabulka, chybějící popisky nebo číslování stran od špatného místa.</w:t>
-      </w:r>
-    </w:p>
-    <w:p>
-      <w:pPr>
-        <w:spacing w:after="120" w:line="259" w:lineRule="auto"/>
-      </w:pPr>
-      <w:r>
-        <w:rPr>
-          <w:rFonts w:ascii="Arial" w:hAnsi="Arial"/>
-          <w:sz w:val="22"/>
-        </w:rPr>
-        <w:t>Přepočtený počet chyb se převede na známku takto:</w:t>
-      </w:r>
-    </w:p>
-    <w:tbl>
-      <w:tblPr>
-        <w:tblW w:type="auto" w:w="0"/>
-        <w:jc w:val="center"/>
-        <w:tblLook w:firstColumn="1" w:firstRow="1" w:lastColumn="0" w:lastRow="0" w:noHBand="0" w:noVBand="1" w:val="04A0"/>
-        <w:tblBorders>
-          <w:top w:val="single" w:sz="6" w:space="0" w:color="D9D9D9"/>
-          <w:left w:val="single" w:sz="6" w:space="0" w:color="D9D9D9"/>
-          <w:bottom w:val="single" w:sz="6" w:space="0" w:color="D9D9D9"/>
-          <w:right w:val="single" w:sz="6" w:space="0" w:color="D9D9D9"/>
-          <w:insideH w:val="single" w:sz="6" w:space="0" w:color="D9D9D9"/>
-          <w:insideV w:val="single" w:sz="6" w:space="0" w:color="D9D9D9"/>
-        </w:tblBorders>
-      </w:tblPr>
-      <w:tblGrid>
-        <w:gridCol w:w="9972"/>
-      </w:tblGrid>
-      <w:tr>
-        <w:tc>
-          <w:tcPr>
-            <w:tcW w:type="dxa" w:w="9972"/>
-            <w:shd w:fill="F5F5F5"/>
-            <w:vAlign w:val="center"/>
-          </w:tcPr>
-          <w:p>
-            <w:pPr>
-              <w:spacing w:after="0"/>
-            </w:pPr>
-            <w:r>
-              <w:rPr>
-                <w:rFonts w:ascii="Courier New" w:hAnsi="Courier New"/>
-                <w:sz w:val="19"/>
-              </w:rPr>
-              <w:t>1: 0-3 chyby</w:t>
-            </w:r>
-            <w:r>
-              <w:br/>
-            </w:r>
-            <w:r>
-              <w:rPr>
-                <w:rFonts w:ascii="Courier New" w:hAnsi="Courier New"/>
-                <w:sz w:val="19"/>
-              </w:rPr>
-              <w:t>2: 3,5-7 chyb</w:t>
-            </w:r>
-            <w:r>
-              <w:br/>
-            </w:r>
-            <w:r>
-              <w:rPr>
-                <w:rFonts w:ascii="Courier New" w:hAnsi="Courier New"/>
-                <w:sz w:val="19"/>
-              </w:rPr>
-              <w:t>3: 7,5-11 chyb</w:t>
-            </w:r>
-            <w:r>
-              <w:br/>
-            </w:r>
-            <w:r>
-              <w:rPr>
-                <w:rFonts w:ascii="Courier New" w:hAnsi="Courier New"/>
-                <w:sz w:val="19"/>
-              </w:rPr>
-              <w:t>4: 11,5-15 chyb</w:t>
-            </w:r>
-            <w:r>
-              <w:br/>
-            </w:r>
-            <w:r>
-              <w:rPr>
-                <w:rFonts w:ascii="Courier New" w:hAnsi="Courier New"/>
-                <w:sz w:val="19"/>
-              </w:rPr>
-              <w:t>5: 15,5 a více chyb</w:t>
-            </w:r>
-          </w:p>
-        </w:tc>
-      </w:tr>
-    </w:tbl>
-    <w:p>
-      <w:pPr>
-        <w:spacing w:after="120" w:line="259" w:lineRule="auto"/>
-      </w:pPr>
-      <w:r>
-        <w:rPr>
-          <w:rFonts w:ascii="Arial" w:hAnsi="Arial"/>
-          <w:sz w:val="22"/>
-        </w:rPr>
-        <w:t>Opakovaná stejná chyba se nepočítá neomezeně. Pokud se stejný typ chyby opakuje v celém dokumentu, započítá se obvykle podle rozsahu jako 2-3 chyby.</w:t>
-      </w:r>
-    </w:p>
-    <w:p>
-      <w:pPr>
         <w:sectPr>
           <w:pgSz w:w="12240" w:h="15840"/>
           <w:pgMar w:top="1134" w:right="1134" w:bottom="1134" w:left="1134" w:header="720" w:footer="720" w:gutter="0"/>

</xml_diff>